<commit_message>
Report: department-site headcounts, PubMed trends, directory-count script
Co-Authored-By: Claude Fable 5.1 <noreply@anthropic.com>
Claude-Session: https://claude.ai/code/session_01EFoZPGvTa492AmYdUAHk4V
</commit_message>
<xml_diff>
--- a/biolai-peers/report/TAMU_Biology_peer_departments.docx
+++ b/biolai-peers/report/TAMU_Biology_peer_departments.docx
@@ -311,7 +311,7 @@
           <w:i w:val="0"/>
           <w:sz w:val="18"/>
         </w:rPr>
-        <w:t>PubMed: papers listing the department in an author affiliation, publication years 2021 to 2025. Mix distance: Euclidean distance between the department's four-subfield percentage profile and TAMU's (0 = identical). BS/yr: bachelor's degrees in general biology (CIP 26.0101), 2021-22 unless noted.</w:t>
+        <w:t>PubMed: papers listing the department in an author affiliation, publication years 2021 to 2025, with percent change from the 2016 to 2020 count where pulled. Mix distance: Euclidean distance between the department's four-subfield percentage profile and TAMU's (0 = identical). BS/yr: bachelor's degrees in general biology (CIP 26.0101), 2021-22 unless noted.</w:t>
       </w:r>
     </w:p>
     <w:tbl>
@@ -359,7 +359,7 @@
                 <w:b/>
                 <w:sz w:val="15"/>
               </w:rPr>
-              <w:t>PubMed 2021-25</w:t>
+              <w:t>PubMed 2021-25 (change vs 2016-20)</w:t>
             </w:r>
           </w:p>
         </w:tc>
@@ -509,7 +509,7 @@
               <w:rPr>
                 <w:sz w:val="15"/>
               </w:rPr>
-              <w:t>866</w:t>
+              <w:t>866 (+31%)</w:t>
             </w:r>
           </w:p>
         </w:tc>
@@ -565,7 +565,7 @@
               <w:rPr>
                 <w:sz w:val="15"/>
               </w:rPr>
-              <w:t>31 PhDs 2021; ~128 grad students (Peterson's, dated)</w:t>
+              <w:t>128 grad students (Peterson's); 31 PhDs 2021 (IPEDS)</w:t>
             </w:r>
           </w:p>
         </w:tc>
@@ -579,7 +579,7 @@
               <w:rPr>
                 <w:sz w:val="15"/>
               </w:rPr>
-              <w:t>~45-50 T/TT plus ~30 instructional (own knowledge; confirm)</w:t>
+              <w:t>"over 40 faculty" (dept site); Peterson's 35; plus instructional faculty (confirm from directory)</w:t>
             </w:r>
           </w:p>
         </w:tc>
@@ -651,7 +651,7 @@
               <w:rPr>
                 <w:sz w:val="15"/>
               </w:rPr>
-              <w:t>918</w:t>
+              <w:t>918 (+16%)</w:t>
             </w:r>
           </w:p>
         </w:tc>
@@ -707,7 +707,7 @@
               <w:rPr>
                 <w:sz w:val="15"/>
               </w:rPr>
-              <w:t>25 PhDs 2022</w:t>
+              <w:t>136 grad students, 128 PhD (2016 fact sheet); 25 PhDs 2022 (IPEDS)</w:t>
             </w:r>
           </w:p>
         </w:tc>
@@ -721,7 +721,7 @@
               <w:rPr>
                 <w:sz w:val="15"/>
               </w:rPr>
-              <w:t>39 TT + 7 lecturers (2016 fact sheet; current likely 45-50)</w:t>
+              <w:t>39 TT + 13 joint + 7 lecturers (2016 fact sheet; no newer sheet published)</w:t>
             </w:r>
           </w:p>
         </w:tc>
@@ -793,7 +793,7 @@
               <w:rPr>
                 <w:sz w:val="15"/>
               </w:rPr>
-              <w:t>838</w:t>
+              <w:t>838 (+20%)</w:t>
             </w:r>
           </w:p>
         </w:tc>
@@ -849,7 +849,7 @@
               <w:rPr>
                 <w:sz w:val="15"/>
               </w:rPr>
-              <w:t>45 broad CIP 26 (year unspecified)</w:t>
+              <w:t>~100 grad students (dept site); 45 doctorates broad CIP 26</w:t>
             </w:r>
           </w:p>
         </w:tc>
@@ -863,7 +863,7 @@
               <w:rPr>
                 <w:sz w:val="15"/>
               </w:rPr>
-              <w:t>not published; est. 60-80 T/TT</w:t>
+              <w:t>not published; directory shows &gt;=17 tenure-line, 11 teaching-track, 4 research (partial)</w:t>
             </w:r>
           </w:p>
         </w:tc>
@@ -935,7 +935,7 @@
               <w:rPr>
                 <w:sz w:val="15"/>
               </w:rPr>
-              <w:t>630</w:t>
+              <w:t>630 (+12%)</w:t>
             </w:r>
           </w:p>
         </w:tc>
@@ -991,7 +991,7 @@
               <w:rPr>
                 <w:sz w:val="15"/>
               </w:rPr>
-              <w:t>~140 graduate students</w:t>
+              <w:t>130-140 grad students (dept pages); Peterson's 126</w:t>
             </w:r>
           </w:p>
         </w:tc>
@@ -1005,7 +1005,7 @@
               <w:rPr>
                 <w:sz w:val="15"/>
               </w:rPr>
-              <w:t>59 T/TT, largest unit on campus (dept site)</w:t>
+              <w:t>59 TT (dept site; older snapshot "over 60 TT and 15+ instructors"); Peterson's 57 FT</w:t>
             </w:r>
           </w:p>
         </w:tc>
@@ -1077,7 +1077,7 @@
               <w:rPr>
                 <w:sz w:val="15"/>
               </w:rPr>
-              <w:t>778</w:t>
+              <w:t>778 (+20%)</w:t>
             </w:r>
           </w:p>
         </w:tc>
@@ -1133,7 +1133,7 @@
               <w:rPr>
                 <w:sz w:val="15"/>
               </w:rPr>
-              <w:t>27 PhDs 2022</w:t>
+              <w:t>not published; 27 PhDs 2022 (IPEDS)</w:t>
             </w:r>
           </w:p>
         </w:tc>
@@ -1147,7 +1147,7 @@
               <w:rPr>
                 <w:sz w:val="15"/>
               </w:rPr>
-              <w:t>not published; est. 40-50 T/TT</w:t>
+              <w:t>not published; separate research-faculty page; directory not indexable</w:t>
             </w:r>
           </w:p>
         </w:tc>
@@ -1219,7 +1219,7 @@
               <w:rPr>
                 <w:sz w:val="15"/>
               </w:rPr>
-              <w:t>495</w:t>
+              <w:t>495 (+13%)</w:t>
             </w:r>
           </w:p>
         </w:tc>
@@ -1275,7 +1275,7 @@
               <w:rPr>
                 <w:sz w:val="15"/>
               </w:rPr>
-              <w:t>120+ grad students, ~65% PhD (~78)</w:t>
+              <w:t>120+ grad students, 65% PhD (dept); Peterson's 137</w:t>
             </w:r>
           </w:p>
         </w:tc>
@@ -1289,7 +1289,7 @@
               <w:rPr>
                 <w:sz w:val="15"/>
               </w:rPr>
-              <w:t>not published; est. 40-50 T/TT</w:t>
+              <w:t>Peterson's 42 full-time + 6 part-time; 11 emeriti listed separately</w:t>
             </w:r>
           </w:p>
         </w:tc>
@@ -1361,7 +1361,7 @@
               <w:rPr>
                 <w:sz w:val="15"/>
               </w:rPr>
-              <w:t>346</w:t>
+              <w:t>346 (-6%)</w:t>
             </w:r>
           </w:p>
         </w:tc>
@@ -1417,7 +1417,7 @@
               <w:rPr>
                 <w:sz w:val="15"/>
               </w:rPr>
-              <w:t>not published</w:t>
+              <w:t>Peterson's 68 grad students</w:t>
             </w:r>
           </w:p>
         </w:tc>
@@ -1431,7 +1431,7 @@
               <w:rPr>
                 <w:sz w:val="15"/>
               </w:rPr>
-              <w:t>50+ instructional and research faculty (all ranks)</w:t>
+              <w:t>"over 50 instructional and research faculty" (dept); Peterson's 73 FT includes graduate faculty from other units</w:t>
             </w:r>
           </w:p>
         </w:tc>
@@ -1503,7 +1503,7 @@
               <w:rPr>
                 <w:sz w:val="15"/>
               </w:rPr>
-              <w:t>451</w:t>
+              <w:t>451 (+63%)</w:t>
             </w:r>
           </w:p>
         </w:tc>
@@ -1559,7 +1559,7 @@
               <w:rPr>
                 <w:sz w:val="15"/>
               </w:rPr>
-              <w:t>100+ grad students</w:t>
+              <w:t>"over 100 graduate students" (dept site)</w:t>
             </w:r>
           </w:p>
         </w:tc>
@@ -1573,7 +1573,7 @@
               <w:rPr>
                 <w:sz w:val="15"/>
               </w:rPr>
-              <w:t>40-46 (TT + continuing track)</w:t>
+              <w:t>"more than 40 tenure-track and continuing-track faculty, teaching professionals" (dept site)</w:t>
             </w:r>
           </w:p>
         </w:tc>
@@ -3340,7 +3340,7 @@
         <w:rPr>
           <w:color w:val="1F3A5F"/>
         </w:rPr>
-        <w:t>Confidence and what to check</w:t>
+        <w:t>What the department websites say, and what they do not</w:t>
       </w:r>
     </w:p>
     <w:p>
@@ -3351,7 +3351,7 @@
         <w:rPr>
           <w:i w:val="0"/>
         </w:rPr>
-        <w:t>The rankings rest on structure (high confidence, from catalogs and department pages), PubMed counts (high confidence, exact and repeatable, but affiliation strings undercount ecology journals and any faculty who omit the department name), and headcounts (mixed: LSU, Kansas State, Oklahoma State, and Texas Tech publish theirs; Purdue's are from 2016; NC State, Virginia Tech, and Auburn do not publish tenure-line counts). Nothing here depends on a number that cannot be re-derived from the sources in the appendix.</w:t>
+        <w:t>Each finalist's own site was mined for faculty and graduate-student counts, with Peterson's annual survey (self-reported by departments) as the cross-check. What is solid: LSU publishes 59 tenure-track faculty and 130 to 140 graduate students; Purdue's 2016 fact sheet gives 39 tenure-track plus 13 joint faculty and 136 graduate students, 128 of them PhD; Auburn reports 120+ graduate students, 65% PhD, and 42 full-time faculty to Peterson's; NC State's site says about 100 graduate students; Texas Tech says over 100 graduate students and more than 40 tenure-track and continuing-track faculty; Kansas State says over 50 instructional and research faculty and reports 68 graduate students to Peterson's; TAMU reports 128 graduate students to Peterson's and says over 40 faculty on its site.</w:t>
       </w:r>
     </w:p>
     <w:p>
@@ -3362,7 +3362,29 @@
         <w:rPr>
           <w:i w:val="0"/>
         </w:rPr>
-        <w:t>Ten minutes of work would close the main gaps: count the faculty directory pages for Purdue, NC State, Virginia Tech, and Auburn, and ask each graduate coordinator (contacts are in data/seed_pool.csv) for PhDs per year 2019 to 2025. The email draft is ready in the Gmail drafts folder.</w:t>
+        <w:t>What is not solid: the tenure-line faculty count at NC State, Virginia Tech, Auburn, Kansas State, Texas Tech, and TAMU itself. Every one of those directories is a paginated or script-rendered page that the search tool only samples, and this session's network policy blocks fetching the pages directly. The partial rosters that did surface are floors (NC State at least 17 tenure-line and 11 teaching-track; Auburn at least 15 tenure-line), not counts.</w:t>
+      </w:r>
+    </w:p>
+    <w:p>
+      <w:pPr>
+        <w:spacing w:after="120"/>
+      </w:pPr>
+      <w:r>
+        <w:rPr>
+          <w:i w:val="0"/>
+        </w:rPr>
+        <w:t>The fix is one command on a laptop: Rscript R/08_directory_counts.R in the biolai-peers folder downloads all 19 directory pages, saves the text, and tallies names by rank (tenure-line, teaching-track, research, adjunct, emeritus) so the table can be completed and checked by eye in a few minutes.</w:t>
+      </w:r>
+    </w:p>
+    <w:p>
+      <w:pPr>
+        <w:spacing w:after="120"/>
+      </w:pPr>
+      <w:r>
+        <w:rPr>
+          <w:i w:val="0"/>
+        </w:rPr>
+        <w:t>With the publication record the picture is otherwise complete. PubMed counts are exact and repeatable; the affiliation strings undercount ecology journals and any authors who omit the department name, but that bias is the same for every department. The trend column shows TAMU's footprint grew 31% between the two five-year windows, faster than every finalist except Texas Tech (63%, from a small base) and roughly in line with NC State and Virginia Tech (20%).</w:t>
       </w:r>
     </w:p>
     <w:p>

</xml_diff>